<commit_message>
fix: correct 10 m IoU bins in revised draft copy
</commit_message>
<xml_diff>
--- a/docs/paper/paper_draft_revised.docx
+++ b/docs/paper/paper_draft_revised.docx
@@ -1232,7 +1232,7 @@
                 <w:b w:val="0"/>
                 <w:sz w:val="18"/>
               </w:rPr>
-              <w:t>3</w:t>
+              <w:t>4</w:t>
             </w:r>
           </w:p>
         </w:tc>
@@ -1247,7 +1247,7 @@
                 <w:b w:val="0"/>
                 <w:sz w:val="18"/>
               </w:rPr>
-              <w:t>0.32%</w:t>
+              <w:t>0.43%</w:t>
             </w:r>
           </w:p>
         </w:tc>
@@ -1279,7 +1279,7 @@
                 <w:b w:val="0"/>
                 <w:sz w:val="18"/>
               </w:rPr>
-              <w:t>6</w:t>
+              <w:t>5</w:t>
             </w:r>
           </w:p>
         </w:tc>
@@ -1294,7 +1294,7 @@
                 <w:b w:val="0"/>
                 <w:sz w:val="18"/>
               </w:rPr>
-              <w:t>0.64%</w:t>
+              <w:t>0.53%</w:t>
             </w:r>
           </w:p>
         </w:tc>
@@ -1400,7 +1400,7 @@
         <w:pStyle w:val="BodyText"/>
       </w:pPr>
       <w:r>
-        <w:t>At 10 m, 924 of 935 changed images (98.82%) receive no predicted change pixels. Only 11 images receive any prediction: three have IoU below 0.1, six between 0.1 and 0.5, and two at or above 0.5. The two higher-IoU cases show that a few larger changes survive; the remaining nine are less well localized. This is a description of outputs, not evidence for a specific mechanism. The aggregate precision of 99.47% at 10 m is computed from 91,006 predicted pixels against 6,837,404 changed ground-truth pixels, and therefore reflects how little the model predicts rather than reliable detection.</w:t>
+        <w:t>At 10 m, 924 of 935 changed images (98.82%) receive no predicted change pixels. Only 11 images receive any prediction: four have IoU below 0.1, five between 0.1 and 0.5, and two at or above 0.5. The two higher-IoU cases show that a few larger changes survive; the remaining nine are less well localized. This is a description of outputs, not evidence for a specific mechanism. The aggregate precision of 99.47% at 10 m is computed from 91,006 predicted pixels against 6,837,404 changed ground-truth pixels, and therefore reflects how little the model predicts rather than reliable detection.</w:t>
       </w:r>
     </w:p>
     <w:p>

</xml_diff>